<commit_message>
Add initial HTML files for the Kraft Technology Group website
</commit_message>
<xml_diff>
--- a/Documents/Musa Mnanzana WEDE Part 1.docx
+++ b/Documents/Musa Mnanzana WEDE Part 1.docx
@@ -1819,7 +1819,7 @@
           <w:rFonts w:cstheme="minorHAnsi"/>
         </w:rPr>
         <w:pict w14:anchorId="3136588B">
-          <v:rect id="_x0000_i1043" style="width:0;height:.75pt" o:hralign="center" o:hrstd="t" o:hr="t" fillcolor="#a0a0a0" stroked="f"/>
+          <v:rect id="_x0000_i1031" style="width:0;height:.75pt" o:hralign="center" o:hrstd="t" o:hr="t" fillcolor="#a0a0a0" stroked="f"/>
         </w:pict>
       </w:r>
     </w:p>
@@ -1894,7 +1894,7 @@
           <w:rFonts w:cstheme="minorHAnsi"/>
         </w:rPr>
         <w:pict w14:anchorId="0CEF9854">
-          <v:rect id="_x0000_i1044" style="width:0;height:.75pt" o:hralign="center" o:hrstd="t" o:hr="t" fillcolor="#a0a0a0" stroked="f"/>
+          <v:rect id="_x0000_i1032" style="width:0;height:.75pt" o:hralign="center" o:hrstd="t" o:hr="t" fillcolor="#a0a0a0" stroked="f"/>
         </w:pict>
       </w:r>
     </w:p>
@@ -2157,7 +2157,7 @@
           <w:rFonts w:cstheme="minorHAnsi"/>
         </w:rPr>
         <w:pict w14:anchorId="5EB37B19">
-          <v:rect id="_x0000_i1045" style="width:0;height:.75pt" o:hralign="center" o:hrstd="t" o:hr="t" fillcolor="#a0a0a0" stroked="f"/>
+          <v:rect id="_x0000_i1033" style="width:0;height:.75pt" o:hralign="center" o:hrstd="t" o:hr="t" fillcolor="#a0a0a0" stroked="f"/>
         </w:pict>
       </w:r>
     </w:p>
@@ -2389,7 +2389,7 @@
           <w:rFonts w:cstheme="minorHAnsi"/>
         </w:rPr>
         <w:pict w14:anchorId="26864AD8">
-          <v:rect id="_x0000_i1046" style="width:0;height:.75pt" o:hralign="center" o:hrstd="t" o:hr="t" fillcolor="#a0a0a0" stroked="f"/>
+          <v:rect id="_x0000_i1034" style="width:0;height:.75pt" o:hralign="center" o:hrstd="t" o:hr="t" fillcolor="#a0a0a0" stroked="f"/>
         </w:pict>
       </w:r>
     </w:p>
@@ -2570,7 +2570,7 @@
           <w:rFonts w:cstheme="minorHAnsi"/>
         </w:rPr>
         <w:pict w14:anchorId="08F2155E">
-          <v:rect id="_x0000_i1047" style="width:0;height:.75pt" o:hralign="center" o:hrstd="t" o:hr="t" fillcolor="#a0a0a0" stroked="f"/>
+          <v:rect id="_x0000_i1035" style="width:0;height:.75pt" o:hralign="center" o:hrstd="t" o:hr="t" fillcolor="#a0a0a0" stroked="f"/>
         </w:pict>
       </w:r>
     </w:p>
@@ -2652,7 +2652,7 @@
           <w:rFonts w:cstheme="minorHAnsi"/>
         </w:rPr>
         <w:pict w14:anchorId="4A2A62E8">
-          <v:rect id="_x0000_i1048" style="width:0;height:.75pt" o:hralign="center" o:hrstd="t" o:hr="t" fillcolor="#a0a0a0" stroked="f"/>
+          <v:rect id="_x0000_i1036" style="width:0;height:.75pt" o:hralign="center" o:hrstd="t" o:hr="t" fillcolor="#a0a0a0" stroked="f"/>
         </w:pict>
       </w:r>
     </w:p>
@@ -2818,7 +2818,7 @@
           <w:rFonts w:cstheme="minorHAnsi"/>
         </w:rPr>
         <w:pict w14:anchorId="57213B1E">
-          <v:rect id="_x0000_i1049" style="width:0;height:.75pt" o:hralign="center" o:hrstd="t" o:hr="t" fillcolor="#a0a0a0" stroked="f"/>
+          <v:rect id="_x0000_i1037" style="width:0;height:.75pt" o:hralign="center" o:hrstd="t" o:hr="t" fillcolor="#a0a0a0" stroked="f"/>
         </w:pict>
       </w:r>
     </w:p>
@@ -2881,6 +2881,715 @@
         <w:t xml:space="preserve"> A requirements meeting to clarify Kraft Technology Group’s specific service priorities, target client segments, and existing client success stories that can be featured on the website.</w:t>
       </w:r>
     </w:p>
+    <w:p>
+      <w:pPr>
+        <w:pStyle w:val="ds-markdown-paragraph"/>
+        <w:shd w:val="clear" w:color="auto" w:fill="FFFFFF"/>
+        <w:spacing w:before="240" w:beforeAutospacing="0" w:after="240" w:afterAutospacing="0"/>
+        <w:rPr>
+          <w:rFonts w:asciiTheme="minorHAnsi" w:hAnsiTheme="minorHAnsi" w:cstheme="minorHAnsi"/>
+          <w:color w:val="0F1115"/>
+        </w:rPr>
+      </w:pPr>
+      <w:r>
+        <w:rPr>
+          <w:rFonts w:asciiTheme="minorHAnsi" w:hAnsiTheme="minorHAnsi" w:cstheme="minorHAnsi"/>
+          <w:color w:val="0F1115"/>
+        </w:rPr>
+        <w:t xml:space="preserve">Website structure and planning </w:t>
+      </w:r>
+    </w:p>
+    <w:p>
+      <w:pPr>
+        <w:spacing w:before="480" w:after="480"/>
+      </w:pPr>
+      <w:r>
+        <w:pict w14:anchorId="0F51D2A1">
+          <v:rect id="_x0000_i1038" style="width:0;height:.75pt" o:hralign="center" o:hrstd="t" o:hr="t" fillcolor="#a0a0a0" stroked="f"/>
+        </w:pict>
+      </w:r>
+    </w:p>
+    <w:p>
+      <w:pPr>
+        <w:pStyle w:val="Heading2"/>
+        <w:shd w:val="clear" w:color="auto" w:fill="FFFFFF"/>
+        <w:spacing w:before="480" w:after="240" w:line="480" w:lineRule="atLeast"/>
+        <w:rPr>
+          <w:rFonts w:ascii="Segoe UI" w:hAnsi="Segoe UI" w:cs="Segoe UI"/>
+          <w:color w:val="0F1115"/>
+          <w:sz w:val="33"/>
+          <w:szCs w:val="33"/>
+        </w:rPr>
+      </w:pPr>
+      <w:r>
+        <w:rPr>
+          <w:rFonts w:ascii="Segoe UI" w:hAnsi="Segoe UI" w:cs="Segoe UI"/>
+          <w:color w:val="0F1115"/>
+          <w:sz w:val="33"/>
+          <w:szCs w:val="33"/>
+        </w:rPr>
+        <w:t>2. Text-Based Sitemap (Level by Level)</w:t>
+      </w:r>
+    </w:p>
+    <w:p>
+      <w:pPr>
+        <w:pStyle w:val="ds-markdown-paragraph"/>
+        <w:shd w:val="clear" w:color="auto" w:fill="FFFFFF"/>
+        <w:spacing w:before="240" w:beforeAutospacing="0" w:after="240" w:afterAutospacing="0"/>
+        <w:rPr>
+          <w:rFonts w:ascii="Segoe UI" w:hAnsi="Segoe UI" w:cs="Segoe UI"/>
+          <w:color w:val="0F1115"/>
+        </w:rPr>
+      </w:pPr>
+      <w:r>
+        <w:rPr>
+          <w:rStyle w:val="Strong"/>
+          <w:rFonts w:ascii="Segoe UI" w:hAnsi="Segoe UI" w:cs="Segoe UI"/>
+          <w:color w:val="0F1115"/>
+        </w:rPr>
+        <w:t>Level 1 — Entry Point</w:t>
+      </w:r>
+    </w:p>
+    <w:p>
+      <w:pPr>
+        <w:pStyle w:val="ds-markdown-paragraph"/>
+        <w:numPr>
+          <w:ilvl w:val="0"/>
+          <w:numId w:val="5"/>
+        </w:numPr>
+        <w:shd w:val="clear" w:color="auto" w:fill="FFFFFF"/>
+        <w:spacing w:after="120" w:afterAutospacing="0"/>
+        <w:rPr>
+          <w:rFonts w:ascii="Segoe UI" w:hAnsi="Segoe UI" w:cs="Segoe UI"/>
+          <w:color w:val="0F1115"/>
+        </w:rPr>
+      </w:pPr>
+      <w:r>
+        <w:rPr>
+          <w:rStyle w:val="Strong"/>
+          <w:rFonts w:ascii="Segoe UI" w:hAnsi="Segoe UI" w:cs="Segoe UI"/>
+          <w:color w:val="0F1115"/>
+        </w:rPr>
+        <w:t>Homepage</w:t>
+      </w:r>
+      <w:r>
+        <w:rPr>
+          <w:rFonts w:ascii="Segoe UI" w:hAnsi="Segoe UI" w:cs="Segoe UI"/>
+          <w:color w:val="0F1115"/>
+        </w:rPr>
+        <w:t xml:space="preserve"> (</w:t>
+      </w:r>
+      <w:r>
+        <w:rPr>
+          <w:rStyle w:val="HTMLCode"/>
+          <w:rFonts w:ascii="Consolas" w:hAnsi="Consolas"/>
+          <w:color w:val="0F1115"/>
+          <w:shd w:val="clear" w:color="auto" w:fill="EBEEF2"/>
+        </w:rPr>
+        <w:t>index.html</w:t>
+      </w:r>
+      <w:r>
+        <w:rPr>
+          <w:rFonts w:ascii="Segoe UI" w:hAnsi="Segoe UI" w:cs="Segoe UI"/>
+          <w:color w:val="0F1115"/>
+        </w:rPr>
+        <w:t>)</w:t>
+      </w:r>
+    </w:p>
+    <w:p>
+      <w:pPr>
+        <w:pStyle w:val="ds-markdown-paragraph"/>
+        <w:numPr>
+          <w:ilvl w:val="1"/>
+          <w:numId w:val="5"/>
+        </w:numPr>
+        <w:shd w:val="clear" w:color="auto" w:fill="FFFFFF"/>
+        <w:spacing w:after="0" w:afterAutospacing="0"/>
+        <w:rPr>
+          <w:rFonts w:ascii="Segoe UI" w:hAnsi="Segoe UI" w:cs="Segoe UI"/>
+          <w:color w:val="0F1115"/>
+        </w:rPr>
+      </w:pPr>
+      <w:r>
+        <w:rPr>
+          <w:rFonts w:ascii="Segoe UI" w:hAnsi="Segoe UI" w:cs="Segoe UI"/>
+          <w:color w:val="0F1115"/>
+        </w:rPr>
+        <w:t>The main landing page and central hub of the website</w:t>
+      </w:r>
+    </w:p>
+    <w:p>
+      <w:pPr>
+        <w:pStyle w:val="ds-markdown-paragraph"/>
+        <w:numPr>
+          <w:ilvl w:val="1"/>
+          <w:numId w:val="5"/>
+        </w:numPr>
+        <w:shd w:val="clear" w:color="auto" w:fill="FFFFFF"/>
+        <w:spacing w:after="0" w:afterAutospacing="0"/>
+        <w:rPr>
+          <w:rFonts w:ascii="Segoe UI" w:hAnsi="Segoe UI" w:cs="Segoe UI"/>
+          <w:color w:val="0F1115"/>
+        </w:rPr>
+      </w:pPr>
+      <w:r>
+        <w:rPr>
+          <w:rFonts w:ascii="Segoe UI" w:hAnsi="Segoe UI" w:cs="Segoe UI"/>
+          <w:color w:val="0F1115"/>
+        </w:rPr>
+        <w:t>Contains the hero section, "What We Do" overview, and primary call-to-action</w:t>
+      </w:r>
+    </w:p>
+    <w:p>
+      <w:pPr>
+        <w:pStyle w:val="ds-markdown-paragraph"/>
+        <w:numPr>
+          <w:ilvl w:val="1"/>
+          <w:numId w:val="5"/>
+        </w:numPr>
+        <w:shd w:val="clear" w:color="auto" w:fill="FFFFFF"/>
+        <w:spacing w:after="0" w:afterAutospacing="0"/>
+        <w:rPr>
+          <w:rFonts w:ascii="Segoe UI" w:hAnsi="Segoe UI" w:cs="Segoe UI"/>
+          <w:color w:val="0F1115"/>
+        </w:rPr>
+      </w:pPr>
+      <w:r>
+        <w:rPr>
+          <w:rFonts w:ascii="Segoe UI" w:hAnsi="Segoe UI" w:cs="Segoe UI"/>
+          <w:color w:val="0F1115"/>
+        </w:rPr>
+        <w:t>Every other page is reachable from here</w:t>
+      </w:r>
+    </w:p>
+    <w:p>
+      <w:pPr>
+        <w:pStyle w:val="ds-markdown-paragraph"/>
+        <w:shd w:val="clear" w:color="auto" w:fill="FFFFFF"/>
+        <w:spacing w:before="240" w:beforeAutospacing="0" w:after="240" w:afterAutospacing="0"/>
+        <w:rPr>
+          <w:rFonts w:ascii="Segoe UI" w:hAnsi="Segoe UI" w:cs="Segoe UI"/>
+          <w:color w:val="0F1115"/>
+        </w:rPr>
+      </w:pPr>
+      <w:r>
+        <w:rPr>
+          <w:rStyle w:val="Strong"/>
+          <w:rFonts w:ascii="Segoe UI" w:hAnsi="Segoe UI" w:cs="Segoe UI"/>
+          <w:color w:val="0F1115"/>
+        </w:rPr>
+        <w:t>Level 2 — Main Pages (linked from the homepage navigation)</w:t>
+      </w:r>
+    </w:p>
+    <w:tbl>
+      <w:tblPr>
+        <w:tblW w:w="11280" w:type="dxa"/>
+        <w:tblCellMar>
+          <w:top w:w="15" w:type="dxa"/>
+          <w:left w:w="15" w:type="dxa"/>
+          <w:bottom w:w="15" w:type="dxa"/>
+          <w:right w:w="15" w:type="dxa"/>
+        </w:tblCellMar>
+        <w:tblLook w:val="04A0" w:firstRow="1" w:lastRow="0" w:firstColumn="1" w:lastColumn="0" w:noHBand="0" w:noVBand="1"/>
+      </w:tblPr>
+      <w:tblGrid>
+        <w:gridCol w:w="1733"/>
+        <w:gridCol w:w="2506"/>
+        <w:gridCol w:w="7041"/>
+      </w:tblGrid>
+      <w:tr>
+        <w:trPr>
+          <w:tblHeader/>
+        </w:trPr>
+        <w:tc>
+          <w:tcPr>
+            <w:tcW w:w="0" w:type="auto"/>
+            <w:tcBorders>
+              <w:top w:val="nil"/>
+            </w:tcBorders>
+            <w:tcMar>
+              <w:top w:w="150" w:type="dxa"/>
+              <w:left w:w="0" w:type="dxa"/>
+              <w:bottom w:w="150" w:type="dxa"/>
+              <w:right w:w="240" w:type="dxa"/>
+            </w:tcMar>
+            <w:vAlign w:val="center"/>
+            <w:hideMark/>
+          </w:tcPr>
+          <w:p>
+            <w:pPr>
+              <w:spacing w:line="375" w:lineRule="atLeast"/>
+              <w:rPr>
+                <w:rFonts w:ascii="Segoe UI" w:hAnsi="Segoe UI" w:cs="Segoe UI"/>
+                <w:sz w:val="23"/>
+                <w:szCs w:val="23"/>
+              </w:rPr>
+            </w:pPr>
+            <w:r>
+              <w:rPr>
+                <w:rFonts w:ascii="Segoe UI" w:hAnsi="Segoe UI" w:cs="Segoe UI"/>
+                <w:sz w:val="23"/>
+                <w:szCs w:val="23"/>
+              </w:rPr>
+              <w:t>Page</w:t>
+            </w:r>
+          </w:p>
+        </w:tc>
+        <w:tc>
+          <w:tcPr>
+            <w:tcW w:w="0" w:type="auto"/>
+            <w:tcBorders>
+              <w:top w:val="nil"/>
+            </w:tcBorders>
+            <w:tcMar>
+              <w:top w:w="150" w:type="dxa"/>
+              <w:left w:w="240" w:type="dxa"/>
+              <w:bottom w:w="150" w:type="dxa"/>
+              <w:right w:w="240" w:type="dxa"/>
+            </w:tcMar>
+            <w:vAlign w:val="center"/>
+            <w:hideMark/>
+          </w:tcPr>
+          <w:p>
+            <w:pPr>
+              <w:spacing w:line="375" w:lineRule="atLeast"/>
+              <w:rPr>
+                <w:rFonts w:ascii="Segoe UI" w:hAnsi="Segoe UI" w:cs="Segoe UI"/>
+                <w:sz w:val="23"/>
+                <w:szCs w:val="23"/>
+              </w:rPr>
+            </w:pPr>
+            <w:r>
+              <w:rPr>
+                <w:rFonts w:ascii="Segoe UI" w:hAnsi="Segoe UI" w:cs="Segoe UI"/>
+                <w:sz w:val="23"/>
+                <w:szCs w:val="23"/>
+              </w:rPr>
+              <w:t>File</w:t>
+            </w:r>
+          </w:p>
+        </w:tc>
+        <w:tc>
+          <w:tcPr>
+            <w:tcW w:w="0" w:type="auto"/>
+            <w:tcBorders>
+              <w:top w:val="nil"/>
+            </w:tcBorders>
+            <w:tcMar>
+              <w:top w:w="150" w:type="dxa"/>
+              <w:left w:w="240" w:type="dxa"/>
+              <w:bottom w:w="150" w:type="dxa"/>
+              <w:right w:w="240" w:type="dxa"/>
+            </w:tcMar>
+            <w:vAlign w:val="center"/>
+            <w:hideMark/>
+          </w:tcPr>
+          <w:p>
+            <w:pPr>
+              <w:spacing w:line="375" w:lineRule="atLeast"/>
+              <w:rPr>
+                <w:rFonts w:ascii="Segoe UI" w:hAnsi="Segoe UI" w:cs="Segoe UI"/>
+                <w:sz w:val="23"/>
+                <w:szCs w:val="23"/>
+              </w:rPr>
+            </w:pPr>
+            <w:r>
+              <w:rPr>
+                <w:rFonts w:ascii="Segoe UI" w:hAnsi="Segoe UI" w:cs="Segoe UI"/>
+                <w:sz w:val="23"/>
+                <w:szCs w:val="23"/>
+              </w:rPr>
+              <w:t>Purpose</w:t>
+            </w:r>
+          </w:p>
+        </w:tc>
+      </w:tr>
+      <w:tr>
+        <w:tc>
+          <w:tcPr>
+            <w:tcW w:w="0" w:type="auto"/>
+            <w:tcMar>
+              <w:top w:w="150" w:type="dxa"/>
+              <w:left w:w="0" w:type="dxa"/>
+              <w:bottom w:w="150" w:type="dxa"/>
+              <w:right w:w="240" w:type="dxa"/>
+            </w:tcMar>
+            <w:vAlign w:val="center"/>
+            <w:hideMark/>
+          </w:tcPr>
+          <w:p>
+            <w:pPr>
+              <w:spacing w:line="375" w:lineRule="atLeast"/>
+              <w:rPr>
+                <w:rFonts w:ascii="Segoe UI" w:hAnsi="Segoe UI" w:cs="Segoe UI"/>
+                <w:sz w:val="23"/>
+                <w:szCs w:val="23"/>
+              </w:rPr>
+            </w:pPr>
+            <w:r>
+              <w:rPr>
+                <w:rStyle w:val="Strong"/>
+                <w:rFonts w:ascii="Segoe UI" w:hAnsi="Segoe UI" w:cs="Segoe UI"/>
+                <w:sz w:val="23"/>
+                <w:szCs w:val="23"/>
+              </w:rPr>
+              <w:t>About Us</w:t>
+            </w:r>
+          </w:p>
+        </w:tc>
+        <w:tc>
+          <w:tcPr>
+            <w:tcW w:w="0" w:type="auto"/>
+            <w:tcMar>
+              <w:top w:w="150" w:type="dxa"/>
+              <w:left w:w="240" w:type="dxa"/>
+              <w:bottom w:w="150" w:type="dxa"/>
+              <w:right w:w="240" w:type="dxa"/>
+            </w:tcMar>
+            <w:vAlign w:val="center"/>
+            <w:hideMark/>
+          </w:tcPr>
+          <w:p>
+            <w:pPr>
+              <w:spacing w:line="375" w:lineRule="atLeast"/>
+              <w:rPr>
+                <w:rFonts w:ascii="Segoe UI" w:hAnsi="Segoe UI" w:cs="Segoe UI"/>
+                <w:sz w:val="23"/>
+                <w:szCs w:val="23"/>
+              </w:rPr>
+            </w:pPr>
+            <w:r>
+              <w:rPr>
+                <w:rStyle w:val="HTMLCode"/>
+                <w:rFonts w:ascii="Consolas" w:eastAsiaTheme="minorHAnsi" w:hAnsi="Consolas"/>
+                <w:shd w:val="clear" w:color="auto" w:fill="EBEEF2"/>
+              </w:rPr>
+              <w:t>about.html</w:t>
+            </w:r>
+          </w:p>
+        </w:tc>
+        <w:tc>
+          <w:tcPr>
+            <w:tcW w:w="0" w:type="auto"/>
+            <w:tcMar>
+              <w:top w:w="150" w:type="dxa"/>
+              <w:left w:w="240" w:type="dxa"/>
+              <w:bottom w:w="150" w:type="dxa"/>
+              <w:right w:w="0" w:type="dxa"/>
+            </w:tcMar>
+            <w:vAlign w:val="center"/>
+            <w:hideMark/>
+          </w:tcPr>
+          <w:p>
+            <w:pPr>
+              <w:spacing w:line="375" w:lineRule="atLeast"/>
+              <w:rPr>
+                <w:rFonts w:ascii="Segoe UI" w:hAnsi="Segoe UI" w:cs="Segoe UI"/>
+                <w:sz w:val="23"/>
+                <w:szCs w:val="23"/>
+              </w:rPr>
+            </w:pPr>
+            <w:r>
+              <w:rPr>
+                <w:rFonts w:ascii="Segoe UI" w:hAnsi="Segoe UI" w:cs="Segoe UI"/>
+                <w:sz w:val="23"/>
+                <w:szCs w:val="23"/>
+              </w:rPr>
+              <w:t>Company story, mission, vision, why choose us</w:t>
+            </w:r>
+          </w:p>
+        </w:tc>
+      </w:tr>
+      <w:tr>
+        <w:tc>
+          <w:tcPr>
+            <w:tcW w:w="0" w:type="auto"/>
+            <w:tcMar>
+              <w:top w:w="150" w:type="dxa"/>
+              <w:left w:w="0" w:type="dxa"/>
+              <w:bottom w:w="150" w:type="dxa"/>
+              <w:right w:w="240" w:type="dxa"/>
+            </w:tcMar>
+            <w:vAlign w:val="center"/>
+            <w:hideMark/>
+          </w:tcPr>
+          <w:p>
+            <w:pPr>
+              <w:spacing w:line="375" w:lineRule="atLeast"/>
+              <w:rPr>
+                <w:rFonts w:ascii="Segoe UI" w:hAnsi="Segoe UI" w:cs="Segoe UI"/>
+                <w:sz w:val="23"/>
+                <w:szCs w:val="23"/>
+              </w:rPr>
+            </w:pPr>
+            <w:r>
+              <w:rPr>
+                <w:rStyle w:val="Strong"/>
+                <w:rFonts w:ascii="Segoe UI" w:hAnsi="Segoe UI" w:cs="Segoe UI"/>
+                <w:sz w:val="23"/>
+                <w:szCs w:val="23"/>
+              </w:rPr>
+              <w:lastRenderedPageBreak/>
+              <w:t>Services</w:t>
+            </w:r>
+          </w:p>
+        </w:tc>
+        <w:tc>
+          <w:tcPr>
+            <w:tcW w:w="0" w:type="auto"/>
+            <w:tcMar>
+              <w:top w:w="150" w:type="dxa"/>
+              <w:left w:w="240" w:type="dxa"/>
+              <w:bottom w:w="150" w:type="dxa"/>
+              <w:right w:w="240" w:type="dxa"/>
+            </w:tcMar>
+            <w:vAlign w:val="center"/>
+            <w:hideMark/>
+          </w:tcPr>
+          <w:p>
+            <w:pPr>
+              <w:spacing w:line="375" w:lineRule="atLeast"/>
+              <w:rPr>
+                <w:rFonts w:ascii="Segoe UI" w:hAnsi="Segoe UI" w:cs="Segoe UI"/>
+                <w:sz w:val="23"/>
+                <w:szCs w:val="23"/>
+              </w:rPr>
+            </w:pPr>
+            <w:r>
+              <w:rPr>
+                <w:rStyle w:val="HTMLCode"/>
+                <w:rFonts w:ascii="Consolas" w:eastAsiaTheme="minorHAnsi" w:hAnsi="Consolas"/>
+                <w:shd w:val="clear" w:color="auto" w:fill="EBEEF2"/>
+              </w:rPr>
+              <w:t>service.html</w:t>
+            </w:r>
+          </w:p>
+        </w:tc>
+        <w:tc>
+          <w:tcPr>
+            <w:tcW w:w="0" w:type="auto"/>
+            <w:tcMar>
+              <w:top w:w="150" w:type="dxa"/>
+              <w:left w:w="240" w:type="dxa"/>
+              <w:bottom w:w="150" w:type="dxa"/>
+              <w:right w:w="0" w:type="dxa"/>
+            </w:tcMar>
+            <w:vAlign w:val="center"/>
+            <w:hideMark/>
+          </w:tcPr>
+          <w:p>
+            <w:pPr>
+              <w:spacing w:line="375" w:lineRule="atLeast"/>
+              <w:rPr>
+                <w:rFonts w:ascii="Segoe UI" w:hAnsi="Segoe UI" w:cs="Segoe UI"/>
+                <w:sz w:val="23"/>
+                <w:szCs w:val="23"/>
+              </w:rPr>
+            </w:pPr>
+            <w:r>
+              <w:rPr>
+                <w:rFonts w:ascii="Segoe UI" w:hAnsi="Segoe UI" w:cs="Segoe UI"/>
+                <w:sz w:val="23"/>
+                <w:szCs w:val="23"/>
+              </w:rPr>
+              <w:t>Detailed service offerings across six categories</w:t>
+            </w:r>
+          </w:p>
+        </w:tc>
+      </w:tr>
+      <w:tr>
+        <w:tc>
+          <w:tcPr>
+            <w:tcW w:w="0" w:type="auto"/>
+            <w:tcMar>
+              <w:top w:w="150" w:type="dxa"/>
+              <w:left w:w="0" w:type="dxa"/>
+              <w:bottom w:w="150" w:type="dxa"/>
+              <w:right w:w="240" w:type="dxa"/>
+            </w:tcMar>
+            <w:vAlign w:val="center"/>
+            <w:hideMark/>
+          </w:tcPr>
+          <w:p>
+            <w:pPr>
+              <w:spacing w:line="375" w:lineRule="atLeast"/>
+              <w:rPr>
+                <w:rFonts w:ascii="Segoe UI" w:hAnsi="Segoe UI" w:cs="Segoe UI"/>
+                <w:sz w:val="23"/>
+                <w:szCs w:val="23"/>
+              </w:rPr>
+            </w:pPr>
+            <w:r>
+              <w:rPr>
+                <w:rStyle w:val="Strong"/>
+                <w:rFonts w:ascii="Segoe UI" w:hAnsi="Segoe UI" w:cs="Segoe UI"/>
+                <w:sz w:val="23"/>
+                <w:szCs w:val="23"/>
+              </w:rPr>
+              <w:t>Enquiry</w:t>
+            </w:r>
+          </w:p>
+        </w:tc>
+        <w:tc>
+          <w:tcPr>
+            <w:tcW w:w="0" w:type="auto"/>
+            <w:tcMar>
+              <w:top w:w="150" w:type="dxa"/>
+              <w:left w:w="240" w:type="dxa"/>
+              <w:bottom w:w="150" w:type="dxa"/>
+              <w:right w:w="240" w:type="dxa"/>
+            </w:tcMar>
+            <w:vAlign w:val="center"/>
+            <w:hideMark/>
+          </w:tcPr>
+          <w:p>
+            <w:pPr>
+              <w:spacing w:line="375" w:lineRule="atLeast"/>
+              <w:rPr>
+                <w:rFonts w:ascii="Segoe UI" w:hAnsi="Segoe UI" w:cs="Segoe UI"/>
+                <w:sz w:val="23"/>
+                <w:szCs w:val="23"/>
+              </w:rPr>
+            </w:pPr>
+            <w:r>
+              <w:rPr>
+                <w:rStyle w:val="HTMLCode"/>
+                <w:rFonts w:ascii="Consolas" w:eastAsiaTheme="minorHAnsi" w:hAnsi="Consolas"/>
+                <w:shd w:val="clear" w:color="auto" w:fill="EBEEF2"/>
+              </w:rPr>
+              <w:t>enquiry.html</w:t>
+            </w:r>
+          </w:p>
+        </w:tc>
+        <w:tc>
+          <w:tcPr>
+            <w:tcW w:w="0" w:type="auto"/>
+            <w:tcMar>
+              <w:top w:w="150" w:type="dxa"/>
+              <w:left w:w="240" w:type="dxa"/>
+              <w:bottom w:w="150" w:type="dxa"/>
+              <w:right w:w="0" w:type="dxa"/>
+            </w:tcMar>
+            <w:vAlign w:val="center"/>
+            <w:hideMark/>
+          </w:tcPr>
+          <w:p>
+            <w:pPr>
+              <w:spacing w:line="375" w:lineRule="atLeast"/>
+              <w:rPr>
+                <w:rFonts w:ascii="Segoe UI" w:hAnsi="Segoe UI" w:cs="Segoe UI"/>
+                <w:sz w:val="23"/>
+                <w:szCs w:val="23"/>
+              </w:rPr>
+            </w:pPr>
+            <w:r>
+              <w:rPr>
+                <w:rFonts w:ascii="Segoe UI" w:hAnsi="Segoe UI" w:cs="Segoe UI"/>
+                <w:sz w:val="23"/>
+                <w:szCs w:val="23"/>
+              </w:rPr>
+              <w:t>Free assessment request form (lead generation)</w:t>
+            </w:r>
+          </w:p>
+        </w:tc>
+      </w:tr>
+      <w:tr>
+        <w:tc>
+          <w:tcPr>
+            <w:tcW w:w="0" w:type="auto"/>
+            <w:tcMar>
+              <w:top w:w="150" w:type="dxa"/>
+              <w:left w:w="0" w:type="dxa"/>
+              <w:bottom w:w="150" w:type="dxa"/>
+              <w:right w:w="240" w:type="dxa"/>
+            </w:tcMar>
+            <w:vAlign w:val="center"/>
+            <w:hideMark/>
+          </w:tcPr>
+          <w:p>
+            <w:pPr>
+              <w:spacing w:line="375" w:lineRule="atLeast"/>
+              <w:rPr>
+                <w:rFonts w:ascii="Segoe UI" w:hAnsi="Segoe UI" w:cs="Segoe UI"/>
+                <w:sz w:val="23"/>
+                <w:szCs w:val="23"/>
+              </w:rPr>
+            </w:pPr>
+            <w:r>
+              <w:rPr>
+                <w:rStyle w:val="Strong"/>
+                <w:rFonts w:ascii="Segoe UI" w:hAnsi="Segoe UI" w:cs="Segoe UI"/>
+                <w:sz w:val="23"/>
+                <w:szCs w:val="23"/>
+              </w:rPr>
+              <w:t>Contact</w:t>
+            </w:r>
+          </w:p>
+        </w:tc>
+        <w:tc>
+          <w:tcPr>
+            <w:tcW w:w="0" w:type="auto"/>
+            <w:tcMar>
+              <w:top w:w="150" w:type="dxa"/>
+              <w:left w:w="240" w:type="dxa"/>
+              <w:bottom w:w="150" w:type="dxa"/>
+              <w:right w:w="240" w:type="dxa"/>
+            </w:tcMar>
+            <w:vAlign w:val="center"/>
+            <w:hideMark/>
+          </w:tcPr>
+          <w:p>
+            <w:pPr>
+              <w:spacing w:line="375" w:lineRule="atLeast"/>
+              <w:rPr>
+                <w:rFonts w:ascii="Segoe UI" w:hAnsi="Segoe UI" w:cs="Segoe UI"/>
+                <w:sz w:val="23"/>
+                <w:szCs w:val="23"/>
+              </w:rPr>
+            </w:pPr>
+            <w:r>
+              <w:rPr>
+                <w:rStyle w:val="HTMLCode"/>
+                <w:rFonts w:ascii="Consolas" w:eastAsiaTheme="minorHAnsi" w:hAnsi="Consolas"/>
+                <w:shd w:val="clear" w:color="auto" w:fill="EBEEF2"/>
+              </w:rPr>
+              <w:t>contact.html</w:t>
+            </w:r>
+          </w:p>
+        </w:tc>
+        <w:tc>
+          <w:tcPr>
+            <w:tcW w:w="0" w:type="auto"/>
+            <w:tcMar>
+              <w:top w:w="150" w:type="dxa"/>
+              <w:left w:w="240" w:type="dxa"/>
+              <w:bottom w:w="150" w:type="dxa"/>
+              <w:right w:w="0" w:type="dxa"/>
+            </w:tcMar>
+            <w:vAlign w:val="center"/>
+            <w:hideMark/>
+          </w:tcPr>
+          <w:p>
+            <w:pPr>
+              <w:spacing w:line="375" w:lineRule="atLeast"/>
+              <w:rPr>
+                <w:rFonts w:ascii="Segoe UI" w:hAnsi="Segoe UI" w:cs="Segoe UI"/>
+                <w:sz w:val="23"/>
+                <w:szCs w:val="23"/>
+              </w:rPr>
+            </w:pPr>
+            <w:r>
+              <w:rPr>
+                <w:rFonts w:ascii="Segoe UI" w:hAnsi="Segoe UI" w:cs="Segoe UI"/>
+                <w:sz w:val="23"/>
+                <w:szCs w:val="23"/>
+              </w:rPr>
+              <w:t>Phone, email, address, business hours, map</w:t>
+            </w:r>
+          </w:p>
+        </w:tc>
+      </w:tr>
+    </w:tbl>
     <w:p>
       <w:pPr>
         <w:pStyle w:val="ds-markdown-paragraph"/>
@@ -3108,6 +3817,17 @@
       </w:hyperlink>
     </w:p>
     <w:p>
+      <w:pPr>
+        <w:rPr>
+          <w:rStyle w:val="Hyperlink"/>
+          <w:rFonts w:ascii="Segoe UI" w:hAnsi="Segoe UI" w:cs="Segoe UI"/>
+          <w:color w:val="3964FE"/>
+          <w:sz w:val="23"/>
+          <w:szCs w:val="23"/>
+          <w:bdr w:val="single" w:sz="12" w:space="0" w:color="auto" w:frame="1"/>
+          <w:shd w:val="clear" w:color="auto" w:fill="FFFFFF"/>
+        </w:rPr>
+      </w:pPr>
       <w:hyperlink r:id="rId17" w:tgtFrame="_blank" w:history="1">
         <w:r>
           <w:rPr>
@@ -3123,147 +3843,11 @@
         </w:r>
       </w:hyperlink>
     </w:p>
-    <w:p/>
-    <w:p>
-      <w:r>
-        <w:t xml:space="preserve">Can you make both of the </w:t>
-      </w:r>
-      <w:r>
-        <w:t xml:space="preserve">proposals to follow this content structure and remember to keep </w:t>
-      </w:r>
-      <w:r>
-        <w:t xml:space="preserve">maximum of 500 </w:t>
-      </w:r>
-      <w:proofErr w:type="gramStart"/>
-      <w:r>
-        <w:t>words.</w:t>
-      </w:r>
-      <w:proofErr w:type="gramEnd"/>
-      <w:r>
-        <w:t xml:space="preserve"> </w:t>
-      </w:r>
-    </w:p>
-    <w:p>
-      <w:r>
-        <w:t>1.Orginisation overview</w:t>
-      </w:r>
-    </w:p>
-    <w:p>
-      <w:r>
-        <w:t>Name</w:t>
-      </w:r>
-    </w:p>
-    <w:p>
-      <w:r>
-        <w:t>Brief history of organization</w:t>
-      </w:r>
-    </w:p>
-    <w:p>
-      <w:r>
-        <w:t xml:space="preserve">Mission and vision statements </w:t>
-      </w:r>
-    </w:p>
-    <w:p>
-      <w:r>
-        <w:t>Target audience</w:t>
-      </w:r>
-    </w:p>
-    <w:p>
-      <w:r>
-        <w:t xml:space="preserve">2.Website goals and objectives </w:t>
-      </w:r>
-    </w:p>
-    <w:p>
-      <w:r>
-        <w:t xml:space="preserve">Define specific goals for the website </w:t>
-      </w:r>
-    </w:p>
-    <w:p>
-      <w:r>
-        <w:t xml:space="preserve">Determine </w:t>
-      </w:r>
-      <w:r>
-        <w:t>key performance indicators to measure success</w:t>
-      </w:r>
-    </w:p>
-    <w:p>
-      <w:r>
-        <w:t xml:space="preserve">3.Proposed website features and functionality </w:t>
-      </w:r>
-    </w:p>
-    <w:p>
-      <w:r>
-        <w:t xml:space="preserve">Outline essential features and desired functionality </w:t>
-      </w:r>
-    </w:p>
-    <w:p>
-      <w:r>
-        <w:t xml:space="preserve">4.Design and user experience </w:t>
-      </w:r>
-    </w:p>
-    <w:p>
-      <w:r>
-        <w:t xml:space="preserve">Overall design </w:t>
-      </w:r>
-    </w:p>
-    <w:p>
-      <w:proofErr w:type="spellStart"/>
-      <w:r>
-        <w:t>Colour</w:t>
-      </w:r>
-      <w:proofErr w:type="spellEnd"/>
-      <w:r>
-        <w:t xml:space="preserve"> scheme</w:t>
-      </w:r>
-    </w:p>
-    <w:p>
-      <w:r>
-        <w:t xml:space="preserve">Fonts </w:t>
-      </w:r>
-    </w:p>
-    <w:p>
-      <w:r>
-        <w:lastRenderedPageBreak/>
-        <w:t xml:space="preserve">Layout and design </w:t>
-      </w:r>
-    </w:p>
-    <w:p>
-      <w:r>
-        <w:t>User experience considerations</w:t>
-      </w:r>
-    </w:p>
-    <w:p>
-      <w:r>
-        <w:t xml:space="preserve">5.Technical requirements </w:t>
-      </w:r>
-    </w:p>
-    <w:p>
-      <w:r>
-        <w:t>Where to host, domain name requirements, p</w:t>
-      </w:r>
-      <w:r>
-        <w:t xml:space="preserve">rogramming languages and frameworks </w:t>
-      </w:r>
-    </w:p>
-    <w:p>
-      <w:r>
-        <w:t>6.Timeline and milestones</w:t>
-      </w:r>
-    </w:p>
-    <w:p>
-      <w:r>
-        <w:t xml:space="preserve">Create a realistic time frame </w:t>
-      </w:r>
-      <w:r>
-        <w:t xml:space="preserve">for the project with key milestones </w:t>
-      </w:r>
-    </w:p>
-    <w:p>
-      <w:r>
-        <w:t xml:space="preserve">7.Budget </w:t>
-      </w:r>
-    </w:p>
-    <w:p/>
+    <w:p>
+      <w:r>
+        <w:t>https://www.w3schools.com/html/default.asp</w:t>
+      </w:r>
+    </w:p>
     <w:sectPr>
       <w:pgSz w:w="12240" w:h="15840"/>
       <w:pgMar w:top="810" w:right="1440" w:bottom="1440" w:left="1440" w:header="720" w:footer="720" w:gutter="0"/>
@@ -3652,6 +4236,155 @@
     </w:lvl>
   </w:abstractNum>
   <w:abstractNum w:abstractNumId="3" w15:restartNumberingAfterBreak="0">
+    <w:nsid w:val="35595342"/>
+    <w:multiLevelType w:val="multilevel"/>
+    <w:tmpl w:val="90F2308C"/>
+    <w:lvl w:ilvl="0">
+      <w:start w:val="1"/>
+      <w:numFmt w:val="bullet"/>
+      <w:lvlText w:val=""/>
+      <w:lvlJc w:val="left"/>
+      <w:pPr>
+        <w:tabs>
+          <w:tab w:val="num" w:pos="720"/>
+        </w:tabs>
+        <w:ind w:left="720" w:hanging="360"/>
+      </w:pPr>
+      <w:rPr>
+        <w:rFonts w:ascii="Symbol" w:hAnsi="Symbol" w:hint="default"/>
+        <w:sz w:val="20"/>
+      </w:rPr>
+    </w:lvl>
+    <w:lvl w:ilvl="1">
+      <w:start w:val="1"/>
+      <w:numFmt w:val="bullet"/>
+      <w:lvlText w:val="o"/>
+      <w:lvlJc w:val="left"/>
+      <w:pPr>
+        <w:tabs>
+          <w:tab w:val="num" w:pos="1440"/>
+        </w:tabs>
+        <w:ind w:left="1440" w:hanging="360"/>
+      </w:pPr>
+      <w:rPr>
+        <w:rFonts w:ascii="Courier New" w:hAnsi="Courier New" w:hint="default"/>
+        <w:sz w:val="20"/>
+      </w:rPr>
+    </w:lvl>
+    <w:lvl w:ilvl="2" w:tentative="1">
+      <w:start w:val="1"/>
+      <w:numFmt w:val="bullet"/>
+      <w:lvlText w:val=""/>
+      <w:lvlJc w:val="left"/>
+      <w:pPr>
+        <w:tabs>
+          <w:tab w:val="num" w:pos="2160"/>
+        </w:tabs>
+        <w:ind w:left="2160" w:hanging="360"/>
+      </w:pPr>
+      <w:rPr>
+        <w:rFonts w:ascii="Wingdings" w:hAnsi="Wingdings" w:hint="default"/>
+        <w:sz w:val="20"/>
+      </w:rPr>
+    </w:lvl>
+    <w:lvl w:ilvl="3" w:tentative="1">
+      <w:start w:val="1"/>
+      <w:numFmt w:val="bullet"/>
+      <w:lvlText w:val=""/>
+      <w:lvlJc w:val="left"/>
+      <w:pPr>
+        <w:tabs>
+          <w:tab w:val="num" w:pos="2880"/>
+        </w:tabs>
+        <w:ind w:left="2880" w:hanging="360"/>
+      </w:pPr>
+      <w:rPr>
+        <w:rFonts w:ascii="Wingdings" w:hAnsi="Wingdings" w:hint="default"/>
+        <w:sz w:val="20"/>
+      </w:rPr>
+    </w:lvl>
+    <w:lvl w:ilvl="4" w:tentative="1">
+      <w:start w:val="1"/>
+      <w:numFmt w:val="bullet"/>
+      <w:lvlText w:val=""/>
+      <w:lvlJc w:val="left"/>
+      <w:pPr>
+        <w:tabs>
+          <w:tab w:val="num" w:pos="3600"/>
+        </w:tabs>
+        <w:ind w:left="3600" w:hanging="360"/>
+      </w:pPr>
+      <w:rPr>
+        <w:rFonts w:ascii="Wingdings" w:hAnsi="Wingdings" w:hint="default"/>
+        <w:sz w:val="20"/>
+      </w:rPr>
+    </w:lvl>
+    <w:lvl w:ilvl="5" w:tentative="1">
+      <w:start w:val="1"/>
+      <w:numFmt w:val="bullet"/>
+      <w:lvlText w:val=""/>
+      <w:lvlJc w:val="left"/>
+      <w:pPr>
+        <w:tabs>
+          <w:tab w:val="num" w:pos="4320"/>
+        </w:tabs>
+        <w:ind w:left="4320" w:hanging="360"/>
+      </w:pPr>
+      <w:rPr>
+        <w:rFonts w:ascii="Wingdings" w:hAnsi="Wingdings" w:hint="default"/>
+        <w:sz w:val="20"/>
+      </w:rPr>
+    </w:lvl>
+    <w:lvl w:ilvl="6" w:tentative="1">
+      <w:start w:val="1"/>
+      <w:numFmt w:val="bullet"/>
+      <w:lvlText w:val=""/>
+      <w:lvlJc w:val="left"/>
+      <w:pPr>
+        <w:tabs>
+          <w:tab w:val="num" w:pos="5040"/>
+        </w:tabs>
+        <w:ind w:left="5040" w:hanging="360"/>
+      </w:pPr>
+      <w:rPr>
+        <w:rFonts w:ascii="Wingdings" w:hAnsi="Wingdings" w:hint="default"/>
+        <w:sz w:val="20"/>
+      </w:rPr>
+    </w:lvl>
+    <w:lvl w:ilvl="7" w:tentative="1">
+      <w:start w:val="1"/>
+      <w:numFmt w:val="bullet"/>
+      <w:lvlText w:val=""/>
+      <w:lvlJc w:val="left"/>
+      <w:pPr>
+        <w:tabs>
+          <w:tab w:val="num" w:pos="5760"/>
+        </w:tabs>
+        <w:ind w:left="5760" w:hanging="360"/>
+      </w:pPr>
+      <w:rPr>
+        <w:rFonts w:ascii="Wingdings" w:hAnsi="Wingdings" w:hint="default"/>
+        <w:sz w:val="20"/>
+      </w:rPr>
+    </w:lvl>
+    <w:lvl w:ilvl="8" w:tentative="1">
+      <w:start w:val="1"/>
+      <w:numFmt w:val="bullet"/>
+      <w:lvlText w:val=""/>
+      <w:lvlJc w:val="left"/>
+      <w:pPr>
+        <w:tabs>
+          <w:tab w:val="num" w:pos="6480"/>
+        </w:tabs>
+        <w:ind w:left="6480" w:hanging="360"/>
+      </w:pPr>
+      <w:rPr>
+        <w:rFonts w:ascii="Wingdings" w:hAnsi="Wingdings" w:hint="default"/>
+        <w:sz w:val="20"/>
+      </w:rPr>
+    </w:lvl>
+  </w:abstractNum>
+  <w:abstractNum w:abstractNumId="4" w15:restartNumberingAfterBreak="0">
     <w:nsid w:val="5FBB4170"/>
     <w:multiLevelType w:val="hybridMultilevel"/>
     <w:tmpl w:val="5E520026"/>
@@ -3750,6 +4483,9 @@
     <w:abstractNumId w:val="2"/>
   </w:num>
   <w:num w:numId="4">
+    <w:abstractNumId w:val="4"/>
+  </w:num>
+  <w:num w:numId="5">
     <w:abstractNumId w:val="3"/>
   </w:num>
 </w:numbering>
@@ -4299,6 +5035,19 @@
       <w:contextualSpacing/>
     </w:pPr>
   </w:style>
+  <w:style w:type="character" w:styleId="HTMLCode">
+    <w:name w:val="HTML Code"/>
+    <w:basedOn w:val="DefaultParagraphFont"/>
+    <w:uiPriority w:val="99"/>
+    <w:semiHidden/>
+    <w:unhideWhenUsed/>
+    <w:rsid w:val="00186069"/>
+    <w:rPr>
+      <w:rFonts w:ascii="Courier New" w:eastAsia="Times New Roman" w:hAnsi="Courier New" w:cs="Courier New"/>
+      <w:sz w:val="20"/>
+      <w:szCs w:val="20"/>
+    </w:rPr>
+  </w:style>
 </w:styles>
 </file>
 

</xml_diff>